<commit_message>
docs: update docx report with Solana CLMM Vault naming
</commit_message>
<xml_diff>
--- a/Отчет_по_заданиям_Solana_3-13.docx
+++ b/Отчет_по_заданиям_Solana_3-13.docx
@@ -22,7 +22,7 @@
           <w:color w:val="0F172A"/>
           <w:sz w:val="30"/>
         </w:rPr>
-        <w:t>Разработка на Solana: Rust, Anchor, PDA, SPL Токены и Сквозной проект «Liquidity Vault»</w:t>
+        <w:t>Разработка на Solana: Rust, Anchor, PDA, SPL Токены и Сквозной проект «Solana CLMM Vault»</w:t>
         <w:br/>
         <w:t>(Задания с 3 по 13 неделю)</w:t>
         <w:br/>
@@ -211,7 +211,7 @@
         <w:t xml:space="preserve">О чем эта работа: </w:t>
       </w:r>
       <w:r>
-        <w:t>В этом расширенном отчете собрано полное описание всех практических заданий и сквозного курсового проекта по разработке на Solana (с 3 по 13 неделю). В первой части пройден фундаментальный цикл: низкоуровневая модель аккаунтов и сериализация на чистом Rust, деплой первой нативной программы в Devnet, переход на современный фреймворк Anchor, организация децентрализованных профилей на PDA, выпуск и управление SPL-токенами с метаданными Metaplex, а также интеграция высокоскоростного RPC Helius. Во второй части (недели 8–13) реализован полноценный сквозной DeFi-продукт — смарт-контракт хранилища ликвидности «Liquidity Vault»: архитектура PDA-хранилищ, пропорциональный выпуск и сжигание share-токенов через CPI, интеграция с пулом концентрированной ликвидности Raydium CLMM (Devnet), совершение DEX-свопов с защитой от проскальзывания и управление жизненным циклом NFT-позиции ликвидности.</w:t>
+        <w:t>В этом расширенном отчете собрано полное описание всех практических заданий и сквозного курсового проекта по разработке на Solana (с 3 по 13 неделю). В первой части пройден фундаментальный цикл: низкоуровневая модель аккаунтов и сериализация на чистом Rust, деплой первой нативной программы в Devnet, переход на современный фреймворк Anchor, организация децентрализованных профилей на PDA, выпуск и управление SPL-токенами с метаданными Metaplex, а также интеграция высокоскоростного RPC Helius. Во второй части (недели 8–13) реализован полноценный сквозной DeFi-продукт — смарт-контракт хранилища ликвидности «Solana CLMM Vault»: архитектура PDA-хранилищ, пропорциональный выпуск и сжигание share-токенов через CPI, интеграция с пулом концентрированной ликвидности Raydium CLMM (Devnet), совершение DEX-свопов с защитой от проскальзывания и управление жизненным циклом NFT-позиции ликвидности.</w:t>
       </w:r>
     </w:p>
     <w:p>
@@ -1091,7 +1091,7 @@
           <w:color w:val="1E3A8A"/>
           <w:sz w:val="26"/>
         </w:rPr>
-        <w:t>7. Неделя 8: Liquidity Vault Skeleton &amp; User Card (Сквозной проект)</w:t>
+        <w:t>7. Неделя 8: Solana CLMM Vault Skeleton &amp; User Card (Сквозной проект)</w:t>
       </w:r>
     </w:p>
     <w:p>
@@ -1105,7 +1105,7 @@
         <w:t xml:space="preserve">Что нужно было сделать: </w:t>
       </w:r>
       <w:r>
-        <w:t>Спроектировать архитектуру и базовый каркас смарт-контракта пула ликвидности «Liquidity Vault» на Anchor.</w:t>
+        <w:t>Спроектировать архитектуру и базовый каркас смарт-контракта пула ликвидности «Solana CLMM Vault» на Anchor.</w:t>
       </w:r>
     </w:p>
     <w:p>
@@ -2703,7 +2703,7 @@
               <w:rPr>
                 <w:sz w:val="19"/>
               </w:rPr>
-              <w:t>Архитектура Liquidity Vault, VaultState (153B), UserCard (89B)</w:t>
+              <w:t>Архитектура Solana CLMM Vault, VaultState (153B), UserCard (89B)</w:t>
             </w:r>
           </w:p>
         </w:tc>

</xml_diff>